<commit_message>
Restrict supplements to journal attachments and synchronize article references
</commit_message>
<xml_diff>
--- a/supplementary/Article_1_Supplementary_Materials.docx
+++ b/supplementary/Article_1_Supplementary_Materials.docx
@@ -18,7 +18,7 @@
     </w:p>
     <w:p>
       <w:r>
-        <w:t>Version 1.0.1 | Prepared 8 October 2026 | Supplementary methods and source-artifact inventory</w:t>
+        <w:t>Version 1.0.2 | Prepared 8 October 2026 | Supplementary methods and Tables S1-S3</w:t>
       </w:r>
     </w:p>
     <w:p>
@@ -31,7 +31,7 @@
     </w:p>
     <w:p>
       <w:r>
-        <w:t>This supplement supports the manuscript: Machine Learning Framework for Mutation-Derived Gene-Burden Classification from Single-Cell RNA Sequencing in Peripheral Artery Disease. The source data are PRJNA736095 / GSE176415. Table S1 provides run identifiers, GEO biological sample identifiers, source-derived conditions and archived labels. Biological samples and sequencing runs are different units. The original PAD project remains the provenance source; this repository packages the article-specific support materials.</w:t>
+        <w:t>This supplement supports the manuscript: Machine Learning Framework for Mutation-Derived Gene-Burden Classification from Single-Cell RNA-Seq in Peripheral Artery Disease. The source data are PRJNA736095 / GSE176415. Table S1 provides run identifiers, GEO biological sample identifiers, source-derived conditions and archived labels. Biological samples and sequencing runs are different units. The original PAD project remains the provenance source; this repository packages the article-specific support materials.</w:t>
       </w:r>
     </w:p>
     <w:p>
@@ -83,7 +83,7 @@
     </w:p>
     <w:p>
       <w:r>
-        <w:t>Machine-readable table: supplementary/tables/Table_S1_run_metadata_reconciliation.csv. Each row records the run, GSM, BioSample, source tissue label, legacy analysis label and agreement status. Source-derived labels are also provided in data/metadata_source_reconciled.csv; these are not claimed to be the labels used for archived results.</w:t>
+        <w:t>Machine-readable table: tables/Table_S1_run_metadata_reconciliation.csv. Each row records the run, GSM, BioSample, source tissue label, legacy analysis label and agreement status. Source-derived labels are distinguished from those used for archived results.</w:t>
       </w:r>
     </w:p>
     <w:p>
@@ -96,7 +96,7 @@
     </w:p>
     <w:p>
       <w:r>
-        <w:t>Machine-readable table: supplementary/tables/Table_S2_manuscript_reported_claims.csv. Values and text are transcribed from the supplied manuscript and are explicitly not new computational evidence.</w:t>
+        <w:t>Machine-readable table: tables/Table_S2_manuscript_reported_claims.csv. Values and text are transcribed from the supplied manuscript and are explicitly not new computational evidence.</w:t>
       </w:r>
     </w:p>
     <w:p>
@@ -109,33 +109,7 @@
     </w:p>
     <w:p>
       <w:r>
-        <w:t>Machine-readable table: supplementary/tables/Table_S3_claim_artifact_reconciliation.csv. This table records differences in replication, classifier metrics, PCA, coefficient provenance and validation design. Archive files retain their original values; no missing predictions or significant tests are synthesized.</w:t>
-      </w:r>
-    </w:p>
-    <w:p>
-      <w:pPr>
-        <w:pStyle w:val="Heading1"/>
-      </w:pPr>
-      <w:r>
-        <w:t>Supplementary Data S1. Archived computational outputs</w:t>
-      </w:r>
-    </w:p>
-    <w:p>
-      <w:r>
-        <w:t>The archive/baseline and archive/cohort folders contain saved gene-burden matrices, classifier summaries, PCA coordinates and variance, logistic-regression coefficients, and permutation outputs. supplementary/tables contains local and cohort-filtered variant summaries and historical publication-package summaries. These outputs are historical artifacts with unresolved label provenance.</w:t>
-      </w:r>
-    </w:p>
-    <w:p>
-      <w:pPr>
-        <w:pStyle w:val="Heading1"/>
-      </w:pPr>
-      <w:r>
-        <w:t>Supplementary Code S1. Source code and integrity verification</w:t>
-      </w:r>
-    </w:p>
-    <w:p>
-      <w:r>
-        <w:t>Run python scripts/validate_package.py from the repository root to verify the SHA-256 manifest, code syntax, and metadata structure. The validator checks packaging integrity; it does not validate classifier performance. Archived scripts in scripts/legacy require Linux/WSL and their original layout or explicit input/output paths. They are supplied for inspection and reconstruction, not as a tested one-command manuscript reproduction.</w:t>
+        <w:t>Machine-readable table: tables/Table_S3_claim_artifact_reconciliation.csv. This table records differences in replication, classifier metrics, PCA, coefficient provenance and validation design. No missing predictions or significance tests are synthesized.</w:t>
       </w:r>
     </w:p>
     <w:p>
@@ -148,7 +122,7 @@
     </w:p>
     <w:p>
       <w:r>
-        <w:t>Article-specific repository: https://github.com/dauletulyaidyn/pad-mutation-gene-burden-classification. Source sequencing accession: https://www.ncbi.nlm.nih.gov/geo/query/acc.cgi?acc=GSE176415. The previous general project is https://github.com/dauletulyaidyn/somatic-like-scrna-variants-ml-pipeline. This repository has a different article-specific name and scope. SHA-256 provenance is recorded in provenance.json. No journal publication, DOI or scientific replication is asserted.</w:t>
+        <w:t>Source sequencing accession: GSE176415 / PRJNA736095. Code and historical computational outputs are available separately in the article-specific repository: https://github.com/dauletulyaidyn/pad-mutation-gene-burden-classification. The journal attachment consists of this document and the three CSV tables S1-S3.</w:t>
       </w:r>
     </w:p>
     <w:sectPr>

</xml_diff>